<commit_message>
updated the project updating cross relationship between all chunk files
updated the project updating cross relationship between all chunk files
</commit_message>
<xml_diff>
--- a/ib-genai-project/IB_Project_Documents/LLM_Questions.docx
+++ b/ib-genai-project/IB_Project_Documents/LLM_Questions.docx
@@ -139,7 +139,15 @@
         </w:numPr>
       </w:pPr>
       <w:r>
-        <w:t>What are Apple's per-share earnings metrics for FY2025?</w:t>
+        <w:t xml:space="preserve">What </w:t>
+      </w:r>
+      <w:proofErr w:type="gramStart"/>
+      <w:r>
+        <w:t>are</w:t>
+      </w:r>
+      <w:proofErr w:type="gramEnd"/>
+      <w:r>
+        <w:t xml:space="preserve"> Apple's per-share earnings metrics for FY2025?</w:t>
       </w:r>
     </w:p>
     <w:p>
@@ -434,7 +442,15 @@
     </w:p>
     <w:p>
       <w:r>
-        <w:t>create cross realtionship question to be asked</w:t>
+        <w:t xml:space="preserve">create cross </w:t>
+      </w:r>
+      <w:proofErr w:type="spellStart"/>
+      <w:r>
+        <w:t>realtionship</w:t>
+      </w:r>
+      <w:proofErr w:type="spellEnd"/>
+      <w:r>
+        <w:t xml:space="preserve"> question to be asked</w:t>
       </w:r>
     </w:p>
     <w:p>
@@ -485,7 +501,15 @@
         </w:numPr>
       </w:pPr>
       <w:r>
-        <w:t xml:space="preserve">Does Total Assets equal Total Liabilities + Total Equity for FY2025? </w:t>
+        <w:t xml:space="preserve">Does Total Assets </w:t>
+      </w:r>
+      <w:proofErr w:type="gramStart"/>
+      <w:r>
+        <w:t>equal</w:t>
+      </w:r>
+      <w:proofErr w:type="gramEnd"/>
+      <w:r>
+        <w:t xml:space="preserve"> Total Liabilities + Total Equity for FY2025? </w:t>
       </w:r>
       <w:r>
         <w:rPr>
@@ -503,7 +527,15 @@
         </w:numPr>
       </w:pPr>
       <w:r>
-        <w:t>Does Total Current Assets + Total Non-Current Assets equal Total Assets for FY2025?</w:t>
+        <w:t xml:space="preserve">Does Total Current Assets + Total Non-Current Assets </w:t>
+      </w:r>
+      <w:proofErr w:type="gramStart"/>
+      <w:r>
+        <w:t>equal</w:t>
+      </w:r>
+      <w:proofErr w:type="gramEnd"/>
+      <w:r>
+        <w:t xml:space="preserve"> Total Assets for FY2025?</w:t>
       </w:r>
     </w:p>
     <w:p>
@@ -727,6 +759,1031 @@
       </w:pPr>
       <w:r>
         <w:t>Does Total Liabilities ÷ Total Equity (balance sheet) match the Debt-to-Equity Ratio in the ratios file?</w:t>
+      </w:r>
+    </w:p>
+    <w:p/>
+    <w:p>
+      <w:r>
+        <w:t>Below are interview-quality questions grouped by difficulty.</w:t>
+      </w:r>
+    </w:p>
+    <w:p>
+      <w:r>
+        <w:pict w14:anchorId="1F54A08D">
+          <v:rect id="_x0000_i1073" style="width:0;height:1.5pt" o:hralign="center" o:hrstd="t" o:hr="t" fillcolor="#a0a0a0" stroked="f"/>
+        </w:pict>
+      </w:r>
+    </w:p>
+    <w:p>
+      <w:pPr>
+        <w:rPr>
+          <w:b/>
+          <w:bCs/>
+        </w:rPr>
+      </w:pPr>
+      <w:r>
+        <w:rPr>
+          <w:b/>
+          <w:bCs/>
+        </w:rPr>
+        <w:t>1. Financial Analysis Questions</w:t>
+      </w:r>
+    </w:p>
+    <w:p>
+      <w:pPr>
+        <w:numPr>
+          <w:ilvl w:val="0"/>
+          <w:numId w:val="15"/>
+        </w:numPr>
+      </w:pPr>
+      <w:proofErr w:type="spellStart"/>
+      <w:r>
+        <w:t>Analyze</w:t>
+      </w:r>
+      <w:proofErr w:type="spellEnd"/>
+      <w:r>
+        <w:t xml:space="preserve"> Apple's financial position in FY2025 using its Balance Sheet. </w:t>
+      </w:r>
+    </w:p>
+    <w:p>
+      <w:pPr>
+        <w:numPr>
+          <w:ilvl w:val="0"/>
+          <w:numId w:val="15"/>
+        </w:numPr>
+      </w:pPr>
+      <w:r>
+        <w:t xml:space="preserve">What are the major changes in Apple's assets and liabilities between FY2024 and FY2025? </w:t>
+      </w:r>
+    </w:p>
+    <w:p>
+      <w:pPr>
+        <w:numPr>
+          <w:ilvl w:val="0"/>
+          <w:numId w:val="15"/>
+        </w:numPr>
+      </w:pPr>
+      <w:r>
+        <w:t xml:space="preserve">Explain how Apple's capital structure changed over the last five fiscal years. </w:t>
+      </w:r>
+    </w:p>
+    <w:p>
+      <w:pPr>
+        <w:numPr>
+          <w:ilvl w:val="0"/>
+          <w:numId w:val="15"/>
+        </w:numPr>
+      </w:pPr>
+      <w:r>
+        <w:t xml:space="preserve">What factors contributed to Apple's increase in net income during FY2025? </w:t>
+      </w:r>
+    </w:p>
+    <w:p>
+      <w:pPr>
+        <w:numPr>
+          <w:ilvl w:val="0"/>
+          <w:numId w:val="15"/>
+        </w:numPr>
+      </w:pPr>
+      <w:r>
+        <w:t xml:space="preserve">Evaluate Apple's liquidity using Current Ratio, Quick Ratio, and Cash Ratio. </w:t>
+      </w:r>
+    </w:p>
+    <w:p>
+      <w:pPr>
+        <w:numPr>
+          <w:ilvl w:val="0"/>
+          <w:numId w:val="15"/>
+        </w:numPr>
+      </w:pPr>
+      <w:r>
+        <w:t xml:space="preserve">Discuss whether Apple is overleveraged based on Debt-to-Equity and Debt-to-Assets ratios. </w:t>
+      </w:r>
+    </w:p>
+    <w:p>
+      <w:pPr>
+        <w:numPr>
+          <w:ilvl w:val="0"/>
+          <w:numId w:val="15"/>
+        </w:numPr>
+      </w:pPr>
+      <w:proofErr w:type="spellStart"/>
+      <w:r>
+        <w:t>Analyze</w:t>
+      </w:r>
+      <w:proofErr w:type="spellEnd"/>
+      <w:r>
+        <w:t xml:space="preserve"> Apple's profitability trend from FY2021 through FY2025. </w:t>
+      </w:r>
+    </w:p>
+    <w:p>
+      <w:pPr>
+        <w:numPr>
+          <w:ilvl w:val="0"/>
+          <w:numId w:val="15"/>
+        </w:numPr>
+      </w:pPr>
+      <w:r>
+        <w:lastRenderedPageBreak/>
+        <w:t xml:space="preserve">Evaluate whether Apple's operating performance improved during the five-year period. </w:t>
+      </w:r>
+    </w:p>
+    <w:p>
+      <w:pPr>
+        <w:numPr>
+          <w:ilvl w:val="0"/>
+          <w:numId w:val="15"/>
+        </w:numPr>
+      </w:pPr>
+      <w:r>
+        <w:t xml:space="preserve">Which balance sheet accounts experienced the largest changes in FY2025? </w:t>
+      </w:r>
+    </w:p>
+    <w:p>
+      <w:pPr>
+        <w:numPr>
+          <w:ilvl w:val="0"/>
+          <w:numId w:val="15"/>
+        </w:numPr>
+      </w:pPr>
+      <w:r>
+        <w:t xml:space="preserve">Summarize Apple's overall financial health using all available statements. </w:t>
+      </w:r>
+    </w:p>
+    <w:p>
+      <w:r>
+        <w:pict w14:anchorId="0CA00317">
+          <v:rect id="_x0000_i1074" style="width:0;height:1.5pt" o:hralign="center" o:hrstd="t" o:hr="t" fillcolor="#a0a0a0" stroked="f"/>
+        </w:pict>
+      </w:r>
+    </w:p>
+    <w:p>
+      <w:pPr>
+        <w:rPr>
+          <w:b/>
+          <w:bCs/>
+        </w:rPr>
+      </w:pPr>
+      <w:r>
+        <w:rPr>
+          <w:b/>
+          <w:bCs/>
+        </w:rPr>
+        <w:t>2. Cross-Statement Reasoning Questions</w:t>
+      </w:r>
+    </w:p>
+    <w:p>
+      <w:pPr>
+        <w:numPr>
+          <w:ilvl w:val="0"/>
+          <w:numId w:val="16"/>
+        </w:numPr>
+      </w:pPr>
+      <w:r>
+        <w:t xml:space="preserve">Explain how Revenue reported in the Income Statement affected Operating Cash Flow. </w:t>
+      </w:r>
+    </w:p>
+    <w:p>
+      <w:pPr>
+        <w:numPr>
+          <w:ilvl w:val="0"/>
+          <w:numId w:val="16"/>
+        </w:numPr>
+      </w:pPr>
+      <w:r>
+        <w:t xml:space="preserve">How does Net Income flow into Shareholders' Equity? </w:t>
+      </w:r>
+    </w:p>
+    <w:p>
+      <w:pPr>
+        <w:numPr>
+          <w:ilvl w:val="0"/>
+          <w:numId w:val="16"/>
+        </w:numPr>
+      </w:pPr>
+      <w:r>
+        <w:t xml:space="preserve">Explain the relationship between Free Cash Flow and Capital Expenditure. </w:t>
+      </w:r>
+    </w:p>
+    <w:p>
+      <w:pPr>
+        <w:numPr>
+          <w:ilvl w:val="0"/>
+          <w:numId w:val="16"/>
+        </w:numPr>
+      </w:pPr>
+      <w:r>
+        <w:t xml:space="preserve">Compare Net Income, Operating Income, and EBITDA. </w:t>
+      </w:r>
+    </w:p>
+    <w:p>
+      <w:pPr>
+        <w:numPr>
+          <w:ilvl w:val="0"/>
+          <w:numId w:val="16"/>
+        </w:numPr>
+      </w:pPr>
+      <w:r>
+        <w:t xml:space="preserve">Explain how depreciation affects the Income Statement, Cash Flow Statement, and Balance Sheet. </w:t>
+      </w:r>
+    </w:p>
+    <w:p>
+      <w:pPr>
+        <w:numPr>
+          <w:ilvl w:val="0"/>
+          <w:numId w:val="16"/>
+        </w:numPr>
+      </w:pPr>
+      <w:r>
+        <w:t xml:space="preserve">Why can Operating Cash Flow increase even when Revenue growth slows? </w:t>
+      </w:r>
+    </w:p>
+    <w:p>
+      <w:pPr>
+        <w:numPr>
+          <w:ilvl w:val="0"/>
+          <w:numId w:val="16"/>
+        </w:numPr>
+      </w:pPr>
+      <w:r>
+        <w:t xml:space="preserve">Explain the relationship between Working Capital and Current Assets. </w:t>
+      </w:r>
+    </w:p>
+    <w:p>
+      <w:pPr>
+        <w:numPr>
+          <w:ilvl w:val="0"/>
+          <w:numId w:val="16"/>
+        </w:numPr>
+      </w:pPr>
+      <w:r>
+        <w:t xml:space="preserve">How does increasing inventory impact cash flow? </w:t>
+      </w:r>
+    </w:p>
+    <w:p>
+      <w:pPr>
+        <w:numPr>
+          <w:ilvl w:val="0"/>
+          <w:numId w:val="16"/>
+        </w:numPr>
+      </w:pPr>
+      <w:r>
+        <w:t xml:space="preserve">Explain how debt issuance impacts all three financial statements. </w:t>
+      </w:r>
+    </w:p>
+    <w:p>
+      <w:pPr>
+        <w:numPr>
+          <w:ilvl w:val="0"/>
+          <w:numId w:val="16"/>
+        </w:numPr>
+      </w:pPr>
+      <w:r>
+        <w:t xml:space="preserve">Trace Apple's FY2025 Net Income across the Income Statement, Cash Flow Statement, and Key Metrics. </w:t>
+      </w:r>
+    </w:p>
+    <w:p>
+      <w:r>
+        <w:pict w14:anchorId="71A32FDE">
+          <v:rect id="_x0000_i1075" style="width:0;height:1.5pt" o:hralign="center" o:hrstd="t" o:hr="t" fillcolor="#a0a0a0" stroked="f"/>
+        </w:pict>
+      </w:r>
+    </w:p>
+    <w:p>
+      <w:pPr>
+        <w:rPr>
+          <w:b/>
+          <w:bCs/>
+        </w:rPr>
+      </w:pPr>
+      <w:r>
+        <w:rPr>
+          <w:b/>
+          <w:bCs/>
+        </w:rPr>
+        <w:t>3. Trend Analysis Questions</w:t>
+      </w:r>
+    </w:p>
+    <w:p>
+      <w:pPr>
+        <w:numPr>
+          <w:ilvl w:val="0"/>
+          <w:numId w:val="17"/>
+        </w:numPr>
+      </w:pPr>
+      <w:r>
+        <w:t xml:space="preserve">What financial trends can be observed between FY2021 and FY2025? </w:t>
+      </w:r>
+    </w:p>
+    <w:p>
+      <w:pPr>
+        <w:numPr>
+          <w:ilvl w:val="0"/>
+          <w:numId w:val="17"/>
+        </w:numPr>
+      </w:pPr>
+      <w:r>
+        <w:t xml:space="preserve">Which metrics improved the most over five years? </w:t>
+      </w:r>
+    </w:p>
+    <w:p>
+      <w:pPr>
+        <w:numPr>
+          <w:ilvl w:val="0"/>
+          <w:numId w:val="17"/>
+        </w:numPr>
+      </w:pPr>
+      <w:r>
+        <w:t xml:space="preserve">Which metrics deteriorated? </w:t>
+      </w:r>
+    </w:p>
+    <w:p>
+      <w:pPr>
+        <w:numPr>
+          <w:ilvl w:val="0"/>
+          <w:numId w:val="17"/>
+        </w:numPr>
+      </w:pPr>
+      <w:r>
+        <w:t xml:space="preserve">Has Apple's liquidity improved? </w:t>
+      </w:r>
+    </w:p>
+    <w:p>
+      <w:pPr>
+        <w:numPr>
+          <w:ilvl w:val="0"/>
+          <w:numId w:val="17"/>
+        </w:numPr>
+      </w:pPr>
+      <w:r>
+        <w:t xml:space="preserve">Has Apple's profitability improved? </w:t>
+      </w:r>
+    </w:p>
+    <w:p>
+      <w:pPr>
+        <w:numPr>
+          <w:ilvl w:val="0"/>
+          <w:numId w:val="17"/>
+        </w:numPr>
+      </w:pPr>
+      <w:r>
+        <w:t xml:space="preserve">Compare Revenue Growth with Net Income Growth. </w:t>
+      </w:r>
+    </w:p>
+    <w:p>
+      <w:pPr>
+        <w:numPr>
+          <w:ilvl w:val="0"/>
+          <w:numId w:val="17"/>
+        </w:numPr>
+      </w:pPr>
+      <w:r>
+        <w:t xml:space="preserve">Compare Asset Growth with Revenue Growth. </w:t>
+      </w:r>
+    </w:p>
+    <w:p>
+      <w:pPr>
+        <w:numPr>
+          <w:ilvl w:val="0"/>
+          <w:numId w:val="17"/>
+        </w:numPr>
+      </w:pPr>
+      <w:r>
+        <w:t xml:space="preserve">Compare Debt Growth with Operating Cash Flow Growth. </w:t>
+      </w:r>
+    </w:p>
+    <w:p>
+      <w:pPr>
+        <w:numPr>
+          <w:ilvl w:val="0"/>
+          <w:numId w:val="17"/>
+        </w:numPr>
+      </w:pPr>
+      <w:r>
+        <w:t xml:space="preserve">Did Apple's margins improve over time? </w:t>
+      </w:r>
+    </w:p>
+    <w:p>
+      <w:pPr>
+        <w:numPr>
+          <w:ilvl w:val="0"/>
+          <w:numId w:val="17"/>
+        </w:numPr>
+      </w:pPr>
+      <w:r>
+        <w:t xml:space="preserve">Which long-term growth metric shows the strongest improvement? </w:t>
+      </w:r>
+    </w:p>
+    <w:p>
+      <w:r>
+        <w:pict w14:anchorId="1C703F6D">
+          <v:rect id="_x0000_i1076" style="width:0;height:1.5pt" o:hralign="center" o:hrstd="t" o:hr="t" fillcolor="#a0a0a0" stroked="f"/>
+        </w:pict>
+      </w:r>
+    </w:p>
+    <w:p>
+      <w:pPr>
+        <w:rPr>
+          <w:b/>
+          <w:bCs/>
+        </w:rPr>
+      </w:pPr>
+      <w:r>
+        <w:rPr>
+          <w:b/>
+          <w:bCs/>
+        </w:rPr>
+        <w:t>4. Investment Analysis Questions</w:t>
+      </w:r>
+    </w:p>
+    <w:p>
+      <w:pPr>
+        <w:numPr>
+          <w:ilvl w:val="0"/>
+          <w:numId w:val="18"/>
+        </w:numPr>
+      </w:pPr>
+      <w:r>
+        <w:t xml:space="preserve">Would you consider Apple financially strong enough for long-term investment? </w:t>
+      </w:r>
+    </w:p>
+    <w:p>
+      <w:pPr>
+        <w:numPr>
+          <w:ilvl w:val="0"/>
+          <w:numId w:val="18"/>
+        </w:numPr>
+      </w:pPr>
+      <w:r>
+        <w:lastRenderedPageBreak/>
+        <w:t xml:space="preserve">What financial risks can be identified from Apple's statements? </w:t>
+      </w:r>
+    </w:p>
+    <w:p>
+      <w:pPr>
+        <w:numPr>
+          <w:ilvl w:val="0"/>
+          <w:numId w:val="18"/>
+        </w:numPr>
+      </w:pPr>
+      <w:r>
+        <w:t xml:space="preserve">Is Apple's debt level sustainable? </w:t>
+      </w:r>
+    </w:p>
+    <w:p>
+      <w:pPr>
+        <w:numPr>
+          <w:ilvl w:val="0"/>
+          <w:numId w:val="18"/>
+        </w:numPr>
+      </w:pPr>
+      <w:r>
+        <w:t xml:space="preserve">Evaluate Apple's valuation using Enterprise Value and Market Capitalization. </w:t>
+      </w:r>
+    </w:p>
+    <w:p>
+      <w:pPr>
+        <w:numPr>
+          <w:ilvl w:val="0"/>
+          <w:numId w:val="18"/>
+        </w:numPr>
+      </w:pPr>
+      <w:r>
+        <w:t xml:space="preserve">Does Apple generate sufficient cash to support dividends? </w:t>
+      </w:r>
+    </w:p>
+    <w:p>
+      <w:pPr>
+        <w:numPr>
+          <w:ilvl w:val="0"/>
+          <w:numId w:val="18"/>
+        </w:numPr>
+      </w:pPr>
+      <w:r>
+        <w:t xml:space="preserve">What do Apple's profitability ratios indicate about management efficiency? </w:t>
+      </w:r>
+    </w:p>
+    <w:p>
+      <w:pPr>
+        <w:numPr>
+          <w:ilvl w:val="0"/>
+          <w:numId w:val="18"/>
+        </w:numPr>
+      </w:pPr>
+      <w:r>
+        <w:t xml:space="preserve">Is Apple's Return on Equity sustainable? </w:t>
+      </w:r>
+    </w:p>
+    <w:p>
+      <w:pPr>
+        <w:numPr>
+          <w:ilvl w:val="0"/>
+          <w:numId w:val="18"/>
+        </w:numPr>
+      </w:pPr>
+      <w:r>
+        <w:t xml:space="preserve">How attractive is Apple based on its Price-to-Earnings ratio? </w:t>
+      </w:r>
+    </w:p>
+    <w:p>
+      <w:pPr>
+        <w:numPr>
+          <w:ilvl w:val="0"/>
+          <w:numId w:val="18"/>
+        </w:numPr>
+      </w:pPr>
+      <w:r>
+        <w:t xml:space="preserve">What does Free Cash Flow suggest about Apple's future growth? </w:t>
+      </w:r>
+    </w:p>
+    <w:p>
+      <w:pPr>
+        <w:numPr>
+          <w:ilvl w:val="0"/>
+          <w:numId w:val="18"/>
+        </w:numPr>
+      </w:pPr>
+      <w:r>
+        <w:t xml:space="preserve">Would a value investor or a growth investor find Apple more attractive? Why? </w:t>
+      </w:r>
+    </w:p>
+    <w:p>
+      <w:r>
+        <w:pict w14:anchorId="193E021B">
+          <v:rect id="_x0000_i1077" style="width:0;height:1.5pt" o:hralign="center" o:hrstd="t" o:hr="t" fillcolor="#a0a0a0" stroked="f"/>
+        </w:pict>
+      </w:r>
+    </w:p>
+    <w:p>
+      <w:pPr>
+        <w:rPr>
+          <w:b/>
+          <w:bCs/>
+        </w:rPr>
+      </w:pPr>
+      <w:r>
+        <w:rPr>
+          <w:b/>
+          <w:bCs/>
+        </w:rPr>
+        <w:t>5. Multi-Hop Reasoning Questions</w:t>
+      </w:r>
+    </w:p>
+    <w:p>
+      <w:pPr>
+        <w:numPr>
+          <w:ilvl w:val="0"/>
+          <w:numId w:val="19"/>
+        </w:numPr>
+      </w:pPr>
+      <w:r>
+        <w:t xml:space="preserve">Explain why Apple's Return on Equity is significantly higher than its Return on Assets. </w:t>
+      </w:r>
+    </w:p>
+    <w:p>
+      <w:pPr>
+        <w:numPr>
+          <w:ilvl w:val="0"/>
+          <w:numId w:val="19"/>
+        </w:numPr>
+      </w:pPr>
+      <w:r>
+        <w:t xml:space="preserve">How do Revenue Growth and Gross Margin together explain Net Income Growth? </w:t>
+      </w:r>
+    </w:p>
+    <w:p>
+      <w:pPr>
+        <w:numPr>
+          <w:ilvl w:val="0"/>
+          <w:numId w:val="19"/>
+        </w:numPr>
+      </w:pPr>
+      <w:r>
+        <w:t xml:space="preserve">Compare Enterprise Value growth with Revenue growth. </w:t>
+      </w:r>
+    </w:p>
+    <w:p>
+      <w:pPr>
+        <w:numPr>
+          <w:ilvl w:val="0"/>
+          <w:numId w:val="19"/>
+        </w:numPr>
+      </w:pPr>
+      <w:r>
+        <w:t xml:space="preserve">How did changes in debt influence Enterprise Value? </w:t>
+      </w:r>
+    </w:p>
+    <w:p>
+      <w:pPr>
+        <w:numPr>
+          <w:ilvl w:val="0"/>
+          <w:numId w:val="19"/>
+        </w:numPr>
+      </w:pPr>
+      <w:r>
+        <w:t xml:space="preserve">Explain why Working Capital is negative while Current Ratio remains close to 1. </w:t>
+      </w:r>
+    </w:p>
+    <w:p>
+      <w:pPr>
+        <w:numPr>
+          <w:ilvl w:val="0"/>
+          <w:numId w:val="19"/>
+        </w:numPr>
+      </w:pPr>
+      <w:r>
+        <w:t xml:space="preserve">Does increasing Free Cash Flow always correspond to higher Net Income? </w:t>
+      </w:r>
+    </w:p>
+    <w:p>
+      <w:pPr>
+        <w:numPr>
+          <w:ilvl w:val="0"/>
+          <w:numId w:val="19"/>
+        </w:numPr>
+      </w:pPr>
+      <w:r>
+        <w:t xml:space="preserve">Compare Operating Cash Flow with EBITDA over multiple years. </w:t>
+      </w:r>
+    </w:p>
+    <w:p>
+      <w:pPr>
+        <w:numPr>
+          <w:ilvl w:val="0"/>
+          <w:numId w:val="19"/>
+        </w:numPr>
+      </w:pPr>
+      <w:r>
+        <w:t xml:space="preserve">Explain how inventory changes affected cash generation. </w:t>
+      </w:r>
+    </w:p>
+    <w:p>
+      <w:pPr>
+        <w:numPr>
+          <w:ilvl w:val="0"/>
+          <w:numId w:val="19"/>
+        </w:numPr>
+      </w:pPr>
+      <w:r>
+        <w:t xml:space="preserve">What balance sheet changes most influenced Return on Equity? </w:t>
+      </w:r>
+    </w:p>
+    <w:p>
+      <w:pPr>
+        <w:numPr>
+          <w:ilvl w:val="0"/>
+          <w:numId w:val="19"/>
+        </w:numPr>
+      </w:pPr>
+      <w:r>
+        <w:t xml:space="preserve">Explain the relationship among Revenue Growth, EPS Growth, and Share Repurchases. </w:t>
+      </w:r>
+    </w:p>
+    <w:p>
+      <w:r>
+        <w:pict w14:anchorId="7AE3808D">
+          <v:rect id="_x0000_i1078" style="width:0;height:1.5pt" o:hralign="center" o:hrstd="t" o:hr="t" fillcolor="#a0a0a0" stroked="f"/>
+        </w:pict>
+      </w:r>
+    </w:p>
+    <w:p>
+      <w:pPr>
+        <w:rPr>
+          <w:b/>
+          <w:bCs/>
+        </w:rPr>
+      </w:pPr>
+      <w:r>
+        <w:rPr>
+          <w:b/>
+          <w:bCs/>
+        </w:rPr>
+        <w:t>6. Formula Verification Questions</w:t>
+      </w:r>
+    </w:p>
+    <w:p>
+      <w:pPr>
+        <w:numPr>
+          <w:ilvl w:val="0"/>
+          <w:numId w:val="20"/>
+        </w:numPr>
+      </w:pPr>
+      <w:r>
+        <w:t xml:space="preserve">Verify that Total Assets = Total Liabilities + Total Equity for FY2025. </w:t>
+      </w:r>
+    </w:p>
+    <w:p>
+      <w:pPr>
+        <w:numPr>
+          <w:ilvl w:val="0"/>
+          <w:numId w:val="20"/>
+        </w:numPr>
+      </w:pPr>
+      <w:r>
+        <w:t xml:space="preserve">Verify the Current Ratio using Balance Sheet values. </w:t>
+      </w:r>
+    </w:p>
+    <w:p>
+      <w:pPr>
+        <w:numPr>
+          <w:ilvl w:val="0"/>
+          <w:numId w:val="20"/>
+        </w:numPr>
+      </w:pPr>
+      <w:r>
+        <w:t xml:space="preserve">Calculate Gross Profit Margin using Revenue and Gross Profit. </w:t>
+      </w:r>
+    </w:p>
+    <w:p>
+      <w:pPr>
+        <w:numPr>
+          <w:ilvl w:val="0"/>
+          <w:numId w:val="20"/>
+        </w:numPr>
+      </w:pPr>
+      <w:r>
+        <w:t xml:space="preserve">Verify Net Profit Margin. </w:t>
+      </w:r>
+    </w:p>
+    <w:p>
+      <w:pPr>
+        <w:numPr>
+          <w:ilvl w:val="0"/>
+          <w:numId w:val="20"/>
+        </w:numPr>
+      </w:pPr>
+      <w:r>
+        <w:t xml:space="preserve">Calculate Return on Equity using Net Income and Total Equity. </w:t>
+      </w:r>
+    </w:p>
+    <w:p>
+      <w:pPr>
+        <w:numPr>
+          <w:ilvl w:val="0"/>
+          <w:numId w:val="20"/>
+        </w:numPr>
+      </w:pPr>
+      <w:r>
+        <w:t xml:space="preserve">Verify Enterprise Value using Market Cap and Net Debt. </w:t>
+      </w:r>
+    </w:p>
+    <w:p>
+      <w:pPr>
+        <w:numPr>
+          <w:ilvl w:val="0"/>
+          <w:numId w:val="20"/>
+        </w:numPr>
+      </w:pPr>
+      <w:r>
+        <w:t xml:space="preserve">Verify Net Debt to EBITDA. </w:t>
+      </w:r>
+    </w:p>
+    <w:p>
+      <w:pPr>
+        <w:numPr>
+          <w:ilvl w:val="0"/>
+          <w:numId w:val="20"/>
+        </w:numPr>
+      </w:pPr>
+      <w:r>
+        <w:t xml:space="preserve">Verify Tangible Asset Value. </w:t>
+      </w:r>
+    </w:p>
+    <w:p>
+      <w:pPr>
+        <w:numPr>
+          <w:ilvl w:val="0"/>
+          <w:numId w:val="20"/>
+        </w:numPr>
+      </w:pPr>
+      <w:r>
+        <w:lastRenderedPageBreak/>
+        <w:t xml:space="preserve">Recalculate Debt-to-Equity using Balance Sheet values. </w:t>
+      </w:r>
+    </w:p>
+    <w:p>
+      <w:pPr>
+        <w:numPr>
+          <w:ilvl w:val="0"/>
+          <w:numId w:val="20"/>
+        </w:numPr>
+      </w:pPr>
+      <w:r>
+        <w:t xml:space="preserve">Explain why any formula produces a MATCH, CLOSE, or MISMATCH verdict. </w:t>
+      </w:r>
+    </w:p>
+    <w:p>
+      <w:r>
+        <w:pict w14:anchorId="04C78AA7">
+          <v:rect id="_x0000_i1079" style="width:0;height:1.5pt" o:hralign="center" o:hrstd="t" o:hr="t" fillcolor="#a0a0a0" stroked="f"/>
+        </w:pict>
+      </w:r>
+    </w:p>
+    <w:p>
+      <w:pPr>
+        <w:rPr>
+          <w:b/>
+          <w:bCs/>
+        </w:rPr>
+      </w:pPr>
+      <w:r>
+        <w:rPr>
+          <w:b/>
+          <w:bCs/>
+        </w:rPr>
+        <w:t>7. Executive Summary Questions</w:t>
+      </w:r>
+    </w:p>
+    <w:p>
+      <w:pPr>
+        <w:numPr>
+          <w:ilvl w:val="0"/>
+          <w:numId w:val="21"/>
+        </w:numPr>
+      </w:pPr>
+      <w:r>
+        <w:t xml:space="preserve">Write a CFO-style summary of Apple's FY2025 financial performance. </w:t>
+      </w:r>
+    </w:p>
+    <w:p>
+      <w:pPr>
+        <w:numPr>
+          <w:ilvl w:val="0"/>
+          <w:numId w:val="21"/>
+        </w:numPr>
+      </w:pPr>
+      <w:r>
+        <w:t xml:space="preserve">Write a board-level summary highlighting strengths and weaknesses. </w:t>
+      </w:r>
+    </w:p>
+    <w:p>
+      <w:pPr>
+        <w:numPr>
+          <w:ilvl w:val="0"/>
+          <w:numId w:val="21"/>
+        </w:numPr>
+      </w:pPr>
+      <w:r>
+        <w:t xml:space="preserve">Summarize Apple's financial performance in fewer than 200 words. </w:t>
+      </w:r>
+    </w:p>
+    <w:p>
+      <w:pPr>
+        <w:numPr>
+          <w:ilvl w:val="0"/>
+          <w:numId w:val="21"/>
+        </w:numPr>
+      </w:pPr>
+      <w:r>
+        <w:t xml:space="preserve">Identify the three biggest strengths in Apple's FY2025 financial statements. </w:t>
+      </w:r>
+    </w:p>
+    <w:p>
+      <w:pPr>
+        <w:numPr>
+          <w:ilvl w:val="0"/>
+          <w:numId w:val="21"/>
+        </w:numPr>
+      </w:pPr>
+      <w:r>
+        <w:t xml:space="preserve">Identify the three biggest risks facing Apple. </w:t>
+      </w:r>
+    </w:p>
+    <w:p>
+      <w:pPr>
+        <w:numPr>
+          <w:ilvl w:val="0"/>
+          <w:numId w:val="21"/>
+        </w:numPr>
+      </w:pPr>
+      <w:r>
+        <w:t xml:space="preserve">Explain Apple's financial performance to a non-finance audience. </w:t>
+      </w:r>
+    </w:p>
+    <w:p>
+      <w:pPr>
+        <w:numPr>
+          <w:ilvl w:val="0"/>
+          <w:numId w:val="21"/>
+        </w:numPr>
+      </w:pPr>
+      <w:r>
+        <w:t xml:space="preserve">Summarize Apple's cash generation capabilities. </w:t>
+      </w:r>
+    </w:p>
+    <w:p>
+      <w:pPr>
+        <w:numPr>
+          <w:ilvl w:val="0"/>
+          <w:numId w:val="21"/>
+        </w:numPr>
+      </w:pPr>
+      <w:r>
+        <w:t xml:space="preserve">Summarize Apple's balance sheet quality. </w:t>
+      </w:r>
+    </w:p>
+    <w:p>
+      <w:pPr>
+        <w:numPr>
+          <w:ilvl w:val="0"/>
+          <w:numId w:val="21"/>
+        </w:numPr>
+      </w:pPr>
+      <w:r>
+        <w:t xml:space="preserve">Summarize Apple's profitability. </w:t>
+      </w:r>
+    </w:p>
+    <w:p>
+      <w:pPr>
+        <w:numPr>
+          <w:ilvl w:val="0"/>
+          <w:numId w:val="21"/>
+        </w:numPr>
+      </w:pPr>
+      <w:r>
+        <w:t xml:space="preserve">Provide an investment recommendation using only the supplied financial statements. </w:t>
+      </w:r>
+    </w:p>
+    <w:p>
+      <w:r>
+        <w:pict w14:anchorId="761ECBA8">
+          <v:rect id="_x0000_i1080" style="width:0;height:1.5pt" o:hralign="center" o:hrstd="t" o:hr="t" fillcolor="#a0a0a0" stroked="f"/>
+        </w:pict>
+      </w:r>
+    </w:p>
+    <w:p>
+      <w:pPr>
+        <w:rPr>
+          <w:b/>
+          <w:bCs/>
+        </w:rPr>
+      </w:pPr>
+      <w:r>
+        <w:rPr>
+          <w:b/>
+          <w:bCs/>
+        </w:rPr>
+        <w:t>8. Advanced RAG Evaluation Questions</w:t>
+      </w:r>
+    </w:p>
+    <w:p>
+      <w:r>
+        <w:t>These are particularly useful for benchmarking an LLM-powered financial assistant:</w:t>
+      </w:r>
+    </w:p>
+    <w:p>
+      <w:pPr>
+        <w:numPr>
+          <w:ilvl w:val="0"/>
+          <w:numId w:val="22"/>
+        </w:numPr>
+      </w:pPr>
+      <w:r>
+        <w:t xml:space="preserve">Using the Balance Sheet, Income Statement, Cash Flow Statement, Ratios, Growth Metrics, and Key Metrics together, provide a comprehensive analysis of Apple's FY2025 financial health. </w:t>
+      </w:r>
+    </w:p>
+    <w:p>
+      <w:pPr>
+        <w:numPr>
+          <w:ilvl w:val="0"/>
+          <w:numId w:val="22"/>
+        </w:numPr>
+      </w:pPr>
+      <w:r>
+        <w:t xml:space="preserve">Identify three financial strengths and three financial weaknesses, supporting each point with evidence from multiple statements. </w:t>
+      </w:r>
+    </w:p>
+    <w:p>
+      <w:pPr>
+        <w:numPr>
+          <w:ilvl w:val="0"/>
+          <w:numId w:val="22"/>
+        </w:numPr>
+      </w:pPr>
+      <w:r>
+        <w:t xml:space="preserve">Explain how changes in Revenue, Operating Cash Flow, and Free Cash Flow are connected over the last five fiscal years. </w:t>
+      </w:r>
+    </w:p>
+    <w:p>
+      <w:pPr>
+        <w:numPr>
+          <w:ilvl w:val="0"/>
+          <w:numId w:val="22"/>
+        </w:numPr>
+      </w:pPr>
+      <w:r>
+        <w:t xml:space="preserve">If you were Apple's CFO, what strategic financial priorities would you recommend based on these financial statements? </w:t>
+      </w:r>
+    </w:p>
+    <w:p>
+      <w:pPr>
+        <w:numPr>
+          <w:ilvl w:val="0"/>
+          <w:numId w:val="22"/>
+        </w:numPr>
+      </w:pPr>
+      <w:r>
+        <w:t>Does the financial data suggest Apple is becoming more efficient, more profitable, and less risky? Justify your conclusion with evidence across all uploaded files.</w:t>
       </w:r>
     </w:p>
     <w:p/>
@@ -856,6 +1913,119 @@
     </w:lvl>
   </w:abstractNum>
   <w:abstractNum w:abstractNumId="1" w15:restartNumberingAfterBreak="0">
+    <w:nsid w:val="0F833C9F"/>
+    <w:multiLevelType w:val="multilevel"/>
+    <w:tmpl w:val="D9807D64"/>
+    <w:lvl w:ilvl="0">
+      <w:start w:val="1"/>
+      <w:numFmt w:val="decimal"/>
+      <w:lvlText w:val="%1."/>
+      <w:lvlJc w:val="left"/>
+      <w:pPr>
+        <w:tabs>
+          <w:tab w:val="num" w:pos="720"/>
+        </w:tabs>
+        <w:ind w:left="720" w:hanging="360"/>
+      </w:pPr>
+    </w:lvl>
+    <w:lvl w:ilvl="1" w:tentative="1">
+      <w:start w:val="1"/>
+      <w:numFmt w:val="decimal"/>
+      <w:lvlText w:val="%2."/>
+      <w:lvlJc w:val="left"/>
+      <w:pPr>
+        <w:tabs>
+          <w:tab w:val="num" w:pos="1440"/>
+        </w:tabs>
+        <w:ind w:left="1440" w:hanging="360"/>
+      </w:pPr>
+    </w:lvl>
+    <w:lvl w:ilvl="2" w:tentative="1">
+      <w:start w:val="1"/>
+      <w:numFmt w:val="decimal"/>
+      <w:lvlText w:val="%3."/>
+      <w:lvlJc w:val="left"/>
+      <w:pPr>
+        <w:tabs>
+          <w:tab w:val="num" w:pos="2160"/>
+        </w:tabs>
+        <w:ind w:left="2160" w:hanging="360"/>
+      </w:pPr>
+    </w:lvl>
+    <w:lvl w:ilvl="3" w:tentative="1">
+      <w:start w:val="1"/>
+      <w:numFmt w:val="decimal"/>
+      <w:lvlText w:val="%4."/>
+      <w:lvlJc w:val="left"/>
+      <w:pPr>
+        <w:tabs>
+          <w:tab w:val="num" w:pos="2880"/>
+        </w:tabs>
+        <w:ind w:left="2880" w:hanging="360"/>
+      </w:pPr>
+    </w:lvl>
+    <w:lvl w:ilvl="4" w:tentative="1">
+      <w:start w:val="1"/>
+      <w:numFmt w:val="decimal"/>
+      <w:lvlText w:val="%5."/>
+      <w:lvlJc w:val="left"/>
+      <w:pPr>
+        <w:tabs>
+          <w:tab w:val="num" w:pos="3600"/>
+        </w:tabs>
+        <w:ind w:left="3600" w:hanging="360"/>
+      </w:pPr>
+    </w:lvl>
+    <w:lvl w:ilvl="5" w:tentative="1">
+      <w:start w:val="1"/>
+      <w:numFmt w:val="decimal"/>
+      <w:lvlText w:val="%6."/>
+      <w:lvlJc w:val="left"/>
+      <w:pPr>
+        <w:tabs>
+          <w:tab w:val="num" w:pos="4320"/>
+        </w:tabs>
+        <w:ind w:left="4320" w:hanging="360"/>
+      </w:pPr>
+    </w:lvl>
+    <w:lvl w:ilvl="6" w:tentative="1">
+      <w:start w:val="1"/>
+      <w:numFmt w:val="decimal"/>
+      <w:lvlText w:val="%7."/>
+      <w:lvlJc w:val="left"/>
+      <w:pPr>
+        <w:tabs>
+          <w:tab w:val="num" w:pos="5040"/>
+        </w:tabs>
+        <w:ind w:left="5040" w:hanging="360"/>
+      </w:pPr>
+    </w:lvl>
+    <w:lvl w:ilvl="7" w:tentative="1">
+      <w:start w:val="1"/>
+      <w:numFmt w:val="decimal"/>
+      <w:lvlText w:val="%8."/>
+      <w:lvlJc w:val="left"/>
+      <w:pPr>
+        <w:tabs>
+          <w:tab w:val="num" w:pos="5760"/>
+        </w:tabs>
+        <w:ind w:left="5760" w:hanging="360"/>
+      </w:pPr>
+    </w:lvl>
+    <w:lvl w:ilvl="8" w:tentative="1">
+      <w:start w:val="1"/>
+      <w:numFmt w:val="decimal"/>
+      <w:lvlText w:val="%9."/>
+      <w:lvlJc w:val="left"/>
+      <w:pPr>
+        <w:tabs>
+          <w:tab w:val="num" w:pos="6480"/>
+        </w:tabs>
+        <w:ind w:left="6480" w:hanging="360"/>
+      </w:pPr>
+    </w:lvl>
+  </w:abstractNum>
+  <w:abstractNum w:abstractNumId="2" w15:restartNumberingAfterBreak="0">
     <w:nsid w:val="166441DC"/>
     <w:multiLevelType w:val="multilevel"/>
     <w:tmpl w:val="9B7C52E6"/>
@@ -968,7 +2138,7 @@
       </w:pPr>
     </w:lvl>
   </w:abstractNum>
-  <w:abstractNum w:abstractNumId="2" w15:restartNumberingAfterBreak="0">
+  <w:abstractNum w:abstractNumId="3" w15:restartNumberingAfterBreak="0">
     <w:nsid w:val="21224EEE"/>
     <w:multiLevelType w:val="multilevel"/>
     <w:tmpl w:val="783AE816"/>
@@ -1081,7 +2251,7 @@
       </w:pPr>
     </w:lvl>
   </w:abstractNum>
-  <w:abstractNum w:abstractNumId="3" w15:restartNumberingAfterBreak="0">
+  <w:abstractNum w:abstractNumId="4" w15:restartNumberingAfterBreak="0">
     <w:nsid w:val="22C17944"/>
     <w:multiLevelType w:val="multilevel"/>
     <w:tmpl w:val="0A804AE0"/>
@@ -1194,7 +2364,7 @@
       </w:pPr>
     </w:lvl>
   </w:abstractNum>
-  <w:abstractNum w:abstractNumId="4" w15:restartNumberingAfterBreak="0">
+  <w:abstractNum w:abstractNumId="5" w15:restartNumberingAfterBreak="0">
     <w:nsid w:val="2AE30BB0"/>
     <w:multiLevelType w:val="multilevel"/>
     <w:tmpl w:val="42EA7A00"/>
@@ -1307,7 +2477,233 @@
       </w:pPr>
     </w:lvl>
   </w:abstractNum>
-  <w:abstractNum w:abstractNumId="5" w15:restartNumberingAfterBreak="0">
+  <w:abstractNum w:abstractNumId="6" w15:restartNumberingAfterBreak="0">
+    <w:nsid w:val="39E427AA"/>
+    <w:multiLevelType w:val="multilevel"/>
+    <w:tmpl w:val="98AA3594"/>
+    <w:lvl w:ilvl="0">
+      <w:start w:val="11"/>
+      <w:numFmt w:val="decimal"/>
+      <w:lvlText w:val="%1."/>
+      <w:lvlJc w:val="left"/>
+      <w:pPr>
+        <w:tabs>
+          <w:tab w:val="num" w:pos="720"/>
+        </w:tabs>
+        <w:ind w:left="720" w:hanging="360"/>
+      </w:pPr>
+    </w:lvl>
+    <w:lvl w:ilvl="1" w:tentative="1">
+      <w:start w:val="1"/>
+      <w:numFmt w:val="decimal"/>
+      <w:lvlText w:val="%2."/>
+      <w:lvlJc w:val="left"/>
+      <w:pPr>
+        <w:tabs>
+          <w:tab w:val="num" w:pos="1440"/>
+        </w:tabs>
+        <w:ind w:left="1440" w:hanging="360"/>
+      </w:pPr>
+    </w:lvl>
+    <w:lvl w:ilvl="2" w:tentative="1">
+      <w:start w:val="1"/>
+      <w:numFmt w:val="decimal"/>
+      <w:lvlText w:val="%3."/>
+      <w:lvlJc w:val="left"/>
+      <w:pPr>
+        <w:tabs>
+          <w:tab w:val="num" w:pos="2160"/>
+        </w:tabs>
+        <w:ind w:left="2160" w:hanging="360"/>
+      </w:pPr>
+    </w:lvl>
+    <w:lvl w:ilvl="3" w:tentative="1">
+      <w:start w:val="1"/>
+      <w:numFmt w:val="decimal"/>
+      <w:lvlText w:val="%4."/>
+      <w:lvlJc w:val="left"/>
+      <w:pPr>
+        <w:tabs>
+          <w:tab w:val="num" w:pos="2880"/>
+        </w:tabs>
+        <w:ind w:left="2880" w:hanging="360"/>
+      </w:pPr>
+    </w:lvl>
+    <w:lvl w:ilvl="4" w:tentative="1">
+      <w:start w:val="1"/>
+      <w:numFmt w:val="decimal"/>
+      <w:lvlText w:val="%5."/>
+      <w:lvlJc w:val="left"/>
+      <w:pPr>
+        <w:tabs>
+          <w:tab w:val="num" w:pos="3600"/>
+        </w:tabs>
+        <w:ind w:left="3600" w:hanging="360"/>
+      </w:pPr>
+    </w:lvl>
+    <w:lvl w:ilvl="5" w:tentative="1">
+      <w:start w:val="1"/>
+      <w:numFmt w:val="decimal"/>
+      <w:lvlText w:val="%6."/>
+      <w:lvlJc w:val="left"/>
+      <w:pPr>
+        <w:tabs>
+          <w:tab w:val="num" w:pos="4320"/>
+        </w:tabs>
+        <w:ind w:left="4320" w:hanging="360"/>
+      </w:pPr>
+    </w:lvl>
+    <w:lvl w:ilvl="6" w:tentative="1">
+      <w:start w:val="1"/>
+      <w:numFmt w:val="decimal"/>
+      <w:lvlText w:val="%7."/>
+      <w:lvlJc w:val="left"/>
+      <w:pPr>
+        <w:tabs>
+          <w:tab w:val="num" w:pos="5040"/>
+        </w:tabs>
+        <w:ind w:left="5040" w:hanging="360"/>
+      </w:pPr>
+    </w:lvl>
+    <w:lvl w:ilvl="7" w:tentative="1">
+      <w:start w:val="1"/>
+      <w:numFmt w:val="decimal"/>
+      <w:lvlText w:val="%8."/>
+      <w:lvlJc w:val="left"/>
+      <w:pPr>
+        <w:tabs>
+          <w:tab w:val="num" w:pos="5760"/>
+        </w:tabs>
+        <w:ind w:left="5760" w:hanging="360"/>
+      </w:pPr>
+    </w:lvl>
+    <w:lvl w:ilvl="8" w:tentative="1">
+      <w:start w:val="1"/>
+      <w:numFmt w:val="decimal"/>
+      <w:lvlText w:val="%9."/>
+      <w:lvlJc w:val="left"/>
+      <w:pPr>
+        <w:tabs>
+          <w:tab w:val="num" w:pos="6480"/>
+        </w:tabs>
+        <w:ind w:left="6480" w:hanging="360"/>
+      </w:pPr>
+    </w:lvl>
+  </w:abstractNum>
+  <w:abstractNum w:abstractNumId="7" w15:restartNumberingAfterBreak="0">
+    <w:nsid w:val="3A4D6AD1"/>
+    <w:multiLevelType w:val="multilevel"/>
+    <w:tmpl w:val="5AAAAB8A"/>
+    <w:lvl w:ilvl="0">
+      <w:start w:val="31"/>
+      <w:numFmt w:val="decimal"/>
+      <w:lvlText w:val="%1."/>
+      <w:lvlJc w:val="left"/>
+      <w:pPr>
+        <w:tabs>
+          <w:tab w:val="num" w:pos="720"/>
+        </w:tabs>
+        <w:ind w:left="720" w:hanging="360"/>
+      </w:pPr>
+    </w:lvl>
+    <w:lvl w:ilvl="1" w:tentative="1">
+      <w:start w:val="1"/>
+      <w:numFmt w:val="decimal"/>
+      <w:lvlText w:val="%2."/>
+      <w:lvlJc w:val="left"/>
+      <w:pPr>
+        <w:tabs>
+          <w:tab w:val="num" w:pos="1440"/>
+        </w:tabs>
+        <w:ind w:left="1440" w:hanging="360"/>
+      </w:pPr>
+    </w:lvl>
+    <w:lvl w:ilvl="2" w:tentative="1">
+      <w:start w:val="1"/>
+      <w:numFmt w:val="decimal"/>
+      <w:lvlText w:val="%3."/>
+      <w:lvlJc w:val="left"/>
+      <w:pPr>
+        <w:tabs>
+          <w:tab w:val="num" w:pos="2160"/>
+        </w:tabs>
+        <w:ind w:left="2160" w:hanging="360"/>
+      </w:pPr>
+    </w:lvl>
+    <w:lvl w:ilvl="3" w:tentative="1">
+      <w:start w:val="1"/>
+      <w:numFmt w:val="decimal"/>
+      <w:lvlText w:val="%4."/>
+      <w:lvlJc w:val="left"/>
+      <w:pPr>
+        <w:tabs>
+          <w:tab w:val="num" w:pos="2880"/>
+        </w:tabs>
+        <w:ind w:left="2880" w:hanging="360"/>
+      </w:pPr>
+    </w:lvl>
+    <w:lvl w:ilvl="4" w:tentative="1">
+      <w:start w:val="1"/>
+      <w:numFmt w:val="decimal"/>
+      <w:lvlText w:val="%5."/>
+      <w:lvlJc w:val="left"/>
+      <w:pPr>
+        <w:tabs>
+          <w:tab w:val="num" w:pos="3600"/>
+        </w:tabs>
+        <w:ind w:left="3600" w:hanging="360"/>
+      </w:pPr>
+    </w:lvl>
+    <w:lvl w:ilvl="5" w:tentative="1">
+      <w:start w:val="1"/>
+      <w:numFmt w:val="decimal"/>
+      <w:lvlText w:val="%6."/>
+      <w:lvlJc w:val="left"/>
+      <w:pPr>
+        <w:tabs>
+          <w:tab w:val="num" w:pos="4320"/>
+        </w:tabs>
+        <w:ind w:left="4320" w:hanging="360"/>
+      </w:pPr>
+    </w:lvl>
+    <w:lvl w:ilvl="6" w:tentative="1">
+      <w:start w:val="1"/>
+      <w:numFmt w:val="decimal"/>
+      <w:lvlText w:val="%7."/>
+      <w:lvlJc w:val="left"/>
+      <w:pPr>
+        <w:tabs>
+          <w:tab w:val="num" w:pos="5040"/>
+        </w:tabs>
+        <w:ind w:left="5040" w:hanging="360"/>
+      </w:pPr>
+    </w:lvl>
+    <w:lvl w:ilvl="7" w:tentative="1">
+      <w:start w:val="1"/>
+      <w:numFmt w:val="decimal"/>
+      <w:lvlText w:val="%8."/>
+      <w:lvlJc w:val="left"/>
+      <w:pPr>
+        <w:tabs>
+          <w:tab w:val="num" w:pos="5760"/>
+        </w:tabs>
+        <w:ind w:left="5760" w:hanging="360"/>
+      </w:pPr>
+    </w:lvl>
+    <w:lvl w:ilvl="8" w:tentative="1">
+      <w:start w:val="1"/>
+      <w:numFmt w:val="decimal"/>
+      <w:lvlText w:val="%9."/>
+      <w:lvlJc w:val="left"/>
+      <w:pPr>
+        <w:tabs>
+          <w:tab w:val="num" w:pos="6480"/>
+        </w:tabs>
+        <w:ind w:left="6480" w:hanging="360"/>
+      </w:pPr>
+    </w:lvl>
+  </w:abstractNum>
+  <w:abstractNum w:abstractNumId="8" w15:restartNumberingAfterBreak="0">
     <w:nsid w:val="3E713C0E"/>
     <w:multiLevelType w:val="multilevel"/>
     <w:tmpl w:val="61E638B4"/>
@@ -1420,7 +2816,7 @@
       </w:pPr>
     </w:lvl>
   </w:abstractNum>
-  <w:abstractNum w:abstractNumId="6" w15:restartNumberingAfterBreak="0">
+  <w:abstractNum w:abstractNumId="9" w15:restartNumberingAfterBreak="0">
     <w:nsid w:val="3EDC4C3C"/>
     <w:multiLevelType w:val="multilevel"/>
     <w:tmpl w:val="B3B6E022"/>
@@ -1533,7 +2929,7 @@
       </w:pPr>
     </w:lvl>
   </w:abstractNum>
-  <w:abstractNum w:abstractNumId="7" w15:restartNumberingAfterBreak="0">
+  <w:abstractNum w:abstractNumId="10" w15:restartNumberingAfterBreak="0">
     <w:nsid w:val="42993190"/>
     <w:multiLevelType w:val="multilevel"/>
     <w:tmpl w:val="36303EE2"/>
@@ -1646,7 +3042,120 @@
       </w:pPr>
     </w:lvl>
   </w:abstractNum>
-  <w:abstractNum w:abstractNumId="8" w15:restartNumberingAfterBreak="0">
+  <w:abstractNum w:abstractNumId="11" w15:restartNumberingAfterBreak="0">
+    <w:nsid w:val="48441245"/>
+    <w:multiLevelType w:val="multilevel"/>
+    <w:tmpl w:val="3E00D47E"/>
+    <w:lvl w:ilvl="0">
+      <w:start w:val="51"/>
+      <w:numFmt w:val="decimal"/>
+      <w:lvlText w:val="%1."/>
+      <w:lvlJc w:val="left"/>
+      <w:pPr>
+        <w:tabs>
+          <w:tab w:val="num" w:pos="720"/>
+        </w:tabs>
+        <w:ind w:left="720" w:hanging="360"/>
+      </w:pPr>
+    </w:lvl>
+    <w:lvl w:ilvl="1" w:tentative="1">
+      <w:start w:val="1"/>
+      <w:numFmt w:val="decimal"/>
+      <w:lvlText w:val="%2."/>
+      <w:lvlJc w:val="left"/>
+      <w:pPr>
+        <w:tabs>
+          <w:tab w:val="num" w:pos="1440"/>
+        </w:tabs>
+        <w:ind w:left="1440" w:hanging="360"/>
+      </w:pPr>
+    </w:lvl>
+    <w:lvl w:ilvl="2" w:tentative="1">
+      <w:start w:val="1"/>
+      <w:numFmt w:val="decimal"/>
+      <w:lvlText w:val="%3."/>
+      <w:lvlJc w:val="left"/>
+      <w:pPr>
+        <w:tabs>
+          <w:tab w:val="num" w:pos="2160"/>
+        </w:tabs>
+        <w:ind w:left="2160" w:hanging="360"/>
+      </w:pPr>
+    </w:lvl>
+    <w:lvl w:ilvl="3" w:tentative="1">
+      <w:start w:val="1"/>
+      <w:numFmt w:val="decimal"/>
+      <w:lvlText w:val="%4."/>
+      <w:lvlJc w:val="left"/>
+      <w:pPr>
+        <w:tabs>
+          <w:tab w:val="num" w:pos="2880"/>
+        </w:tabs>
+        <w:ind w:left="2880" w:hanging="360"/>
+      </w:pPr>
+    </w:lvl>
+    <w:lvl w:ilvl="4" w:tentative="1">
+      <w:start w:val="1"/>
+      <w:numFmt w:val="decimal"/>
+      <w:lvlText w:val="%5."/>
+      <w:lvlJc w:val="left"/>
+      <w:pPr>
+        <w:tabs>
+          <w:tab w:val="num" w:pos="3600"/>
+        </w:tabs>
+        <w:ind w:left="3600" w:hanging="360"/>
+      </w:pPr>
+    </w:lvl>
+    <w:lvl w:ilvl="5" w:tentative="1">
+      <w:start w:val="1"/>
+      <w:numFmt w:val="decimal"/>
+      <w:lvlText w:val="%6."/>
+      <w:lvlJc w:val="left"/>
+      <w:pPr>
+        <w:tabs>
+          <w:tab w:val="num" w:pos="4320"/>
+        </w:tabs>
+        <w:ind w:left="4320" w:hanging="360"/>
+      </w:pPr>
+    </w:lvl>
+    <w:lvl w:ilvl="6" w:tentative="1">
+      <w:start w:val="1"/>
+      <w:numFmt w:val="decimal"/>
+      <w:lvlText w:val="%7."/>
+      <w:lvlJc w:val="left"/>
+      <w:pPr>
+        <w:tabs>
+          <w:tab w:val="num" w:pos="5040"/>
+        </w:tabs>
+        <w:ind w:left="5040" w:hanging="360"/>
+      </w:pPr>
+    </w:lvl>
+    <w:lvl w:ilvl="7" w:tentative="1">
+      <w:start w:val="1"/>
+      <w:numFmt w:val="decimal"/>
+      <w:lvlText w:val="%8."/>
+      <w:lvlJc w:val="left"/>
+      <w:pPr>
+        <w:tabs>
+          <w:tab w:val="num" w:pos="5760"/>
+        </w:tabs>
+        <w:ind w:left="5760" w:hanging="360"/>
+      </w:pPr>
+    </w:lvl>
+    <w:lvl w:ilvl="8" w:tentative="1">
+      <w:start w:val="1"/>
+      <w:numFmt w:val="decimal"/>
+      <w:lvlText w:val="%9."/>
+      <w:lvlJc w:val="left"/>
+      <w:pPr>
+        <w:tabs>
+          <w:tab w:val="num" w:pos="6480"/>
+        </w:tabs>
+        <w:ind w:left="6480" w:hanging="360"/>
+      </w:pPr>
+    </w:lvl>
+  </w:abstractNum>
+  <w:abstractNum w:abstractNumId="12" w15:restartNumberingAfterBreak="0">
     <w:nsid w:val="55BD6F34"/>
     <w:multiLevelType w:val="multilevel"/>
     <w:tmpl w:val="DC181C36"/>
@@ -1759,7 +3268,7 @@
       </w:pPr>
     </w:lvl>
   </w:abstractNum>
-  <w:abstractNum w:abstractNumId="9" w15:restartNumberingAfterBreak="0">
+  <w:abstractNum w:abstractNumId="13" w15:restartNumberingAfterBreak="0">
     <w:nsid w:val="5E18020A"/>
     <w:multiLevelType w:val="multilevel"/>
     <w:tmpl w:val="CF581D3C"/>
@@ -1872,7 +3381,7 @@
       </w:pPr>
     </w:lvl>
   </w:abstractNum>
-  <w:abstractNum w:abstractNumId="10" w15:restartNumberingAfterBreak="0">
+  <w:abstractNum w:abstractNumId="14" w15:restartNumberingAfterBreak="0">
     <w:nsid w:val="5F075FE6"/>
     <w:multiLevelType w:val="multilevel"/>
     <w:tmpl w:val="7BBEA0CC"/>
@@ -1985,7 +3494,233 @@
       </w:pPr>
     </w:lvl>
   </w:abstractNum>
-  <w:abstractNum w:abstractNumId="11" w15:restartNumberingAfterBreak="0">
+  <w:abstractNum w:abstractNumId="15" w15:restartNumberingAfterBreak="0">
+    <w:nsid w:val="623304DB"/>
+    <w:multiLevelType w:val="multilevel"/>
+    <w:tmpl w:val="0750E348"/>
+    <w:lvl w:ilvl="0">
+      <w:start w:val="21"/>
+      <w:numFmt w:val="decimal"/>
+      <w:lvlText w:val="%1."/>
+      <w:lvlJc w:val="left"/>
+      <w:pPr>
+        <w:tabs>
+          <w:tab w:val="num" w:pos="720"/>
+        </w:tabs>
+        <w:ind w:left="720" w:hanging="360"/>
+      </w:pPr>
+    </w:lvl>
+    <w:lvl w:ilvl="1" w:tentative="1">
+      <w:start w:val="1"/>
+      <w:numFmt w:val="decimal"/>
+      <w:lvlText w:val="%2."/>
+      <w:lvlJc w:val="left"/>
+      <w:pPr>
+        <w:tabs>
+          <w:tab w:val="num" w:pos="1440"/>
+        </w:tabs>
+        <w:ind w:left="1440" w:hanging="360"/>
+      </w:pPr>
+    </w:lvl>
+    <w:lvl w:ilvl="2" w:tentative="1">
+      <w:start w:val="1"/>
+      <w:numFmt w:val="decimal"/>
+      <w:lvlText w:val="%3."/>
+      <w:lvlJc w:val="left"/>
+      <w:pPr>
+        <w:tabs>
+          <w:tab w:val="num" w:pos="2160"/>
+        </w:tabs>
+        <w:ind w:left="2160" w:hanging="360"/>
+      </w:pPr>
+    </w:lvl>
+    <w:lvl w:ilvl="3" w:tentative="1">
+      <w:start w:val="1"/>
+      <w:numFmt w:val="decimal"/>
+      <w:lvlText w:val="%4."/>
+      <w:lvlJc w:val="left"/>
+      <w:pPr>
+        <w:tabs>
+          <w:tab w:val="num" w:pos="2880"/>
+        </w:tabs>
+        <w:ind w:left="2880" w:hanging="360"/>
+      </w:pPr>
+    </w:lvl>
+    <w:lvl w:ilvl="4" w:tentative="1">
+      <w:start w:val="1"/>
+      <w:numFmt w:val="decimal"/>
+      <w:lvlText w:val="%5."/>
+      <w:lvlJc w:val="left"/>
+      <w:pPr>
+        <w:tabs>
+          <w:tab w:val="num" w:pos="3600"/>
+        </w:tabs>
+        <w:ind w:left="3600" w:hanging="360"/>
+      </w:pPr>
+    </w:lvl>
+    <w:lvl w:ilvl="5" w:tentative="1">
+      <w:start w:val="1"/>
+      <w:numFmt w:val="decimal"/>
+      <w:lvlText w:val="%6."/>
+      <w:lvlJc w:val="left"/>
+      <w:pPr>
+        <w:tabs>
+          <w:tab w:val="num" w:pos="4320"/>
+        </w:tabs>
+        <w:ind w:left="4320" w:hanging="360"/>
+      </w:pPr>
+    </w:lvl>
+    <w:lvl w:ilvl="6" w:tentative="1">
+      <w:start w:val="1"/>
+      <w:numFmt w:val="decimal"/>
+      <w:lvlText w:val="%7."/>
+      <w:lvlJc w:val="left"/>
+      <w:pPr>
+        <w:tabs>
+          <w:tab w:val="num" w:pos="5040"/>
+        </w:tabs>
+        <w:ind w:left="5040" w:hanging="360"/>
+      </w:pPr>
+    </w:lvl>
+    <w:lvl w:ilvl="7" w:tentative="1">
+      <w:start w:val="1"/>
+      <w:numFmt w:val="decimal"/>
+      <w:lvlText w:val="%8."/>
+      <w:lvlJc w:val="left"/>
+      <w:pPr>
+        <w:tabs>
+          <w:tab w:val="num" w:pos="5760"/>
+        </w:tabs>
+        <w:ind w:left="5760" w:hanging="360"/>
+      </w:pPr>
+    </w:lvl>
+    <w:lvl w:ilvl="8" w:tentative="1">
+      <w:start w:val="1"/>
+      <w:numFmt w:val="decimal"/>
+      <w:lvlText w:val="%9."/>
+      <w:lvlJc w:val="left"/>
+      <w:pPr>
+        <w:tabs>
+          <w:tab w:val="num" w:pos="6480"/>
+        </w:tabs>
+        <w:ind w:left="6480" w:hanging="360"/>
+      </w:pPr>
+    </w:lvl>
+  </w:abstractNum>
+  <w:abstractNum w:abstractNumId="16" w15:restartNumberingAfterBreak="0">
+    <w:nsid w:val="6BFA3208"/>
+    <w:multiLevelType w:val="multilevel"/>
+    <w:tmpl w:val="5582DF06"/>
+    <w:lvl w:ilvl="0">
+      <w:start w:val="61"/>
+      <w:numFmt w:val="decimal"/>
+      <w:lvlText w:val="%1."/>
+      <w:lvlJc w:val="left"/>
+      <w:pPr>
+        <w:tabs>
+          <w:tab w:val="num" w:pos="720"/>
+        </w:tabs>
+        <w:ind w:left="720" w:hanging="360"/>
+      </w:pPr>
+    </w:lvl>
+    <w:lvl w:ilvl="1" w:tentative="1">
+      <w:start w:val="1"/>
+      <w:numFmt w:val="decimal"/>
+      <w:lvlText w:val="%2."/>
+      <w:lvlJc w:val="left"/>
+      <w:pPr>
+        <w:tabs>
+          <w:tab w:val="num" w:pos="1440"/>
+        </w:tabs>
+        <w:ind w:left="1440" w:hanging="360"/>
+      </w:pPr>
+    </w:lvl>
+    <w:lvl w:ilvl="2" w:tentative="1">
+      <w:start w:val="1"/>
+      <w:numFmt w:val="decimal"/>
+      <w:lvlText w:val="%3."/>
+      <w:lvlJc w:val="left"/>
+      <w:pPr>
+        <w:tabs>
+          <w:tab w:val="num" w:pos="2160"/>
+        </w:tabs>
+        <w:ind w:left="2160" w:hanging="360"/>
+      </w:pPr>
+    </w:lvl>
+    <w:lvl w:ilvl="3" w:tentative="1">
+      <w:start w:val="1"/>
+      <w:numFmt w:val="decimal"/>
+      <w:lvlText w:val="%4."/>
+      <w:lvlJc w:val="left"/>
+      <w:pPr>
+        <w:tabs>
+          <w:tab w:val="num" w:pos="2880"/>
+        </w:tabs>
+        <w:ind w:left="2880" w:hanging="360"/>
+      </w:pPr>
+    </w:lvl>
+    <w:lvl w:ilvl="4" w:tentative="1">
+      <w:start w:val="1"/>
+      <w:numFmt w:val="decimal"/>
+      <w:lvlText w:val="%5."/>
+      <w:lvlJc w:val="left"/>
+      <w:pPr>
+        <w:tabs>
+          <w:tab w:val="num" w:pos="3600"/>
+        </w:tabs>
+        <w:ind w:left="3600" w:hanging="360"/>
+      </w:pPr>
+    </w:lvl>
+    <w:lvl w:ilvl="5" w:tentative="1">
+      <w:start w:val="1"/>
+      <w:numFmt w:val="decimal"/>
+      <w:lvlText w:val="%6."/>
+      <w:lvlJc w:val="left"/>
+      <w:pPr>
+        <w:tabs>
+          <w:tab w:val="num" w:pos="4320"/>
+        </w:tabs>
+        <w:ind w:left="4320" w:hanging="360"/>
+      </w:pPr>
+    </w:lvl>
+    <w:lvl w:ilvl="6" w:tentative="1">
+      <w:start w:val="1"/>
+      <w:numFmt w:val="decimal"/>
+      <w:lvlText w:val="%7."/>
+      <w:lvlJc w:val="left"/>
+      <w:pPr>
+        <w:tabs>
+          <w:tab w:val="num" w:pos="5040"/>
+        </w:tabs>
+        <w:ind w:left="5040" w:hanging="360"/>
+      </w:pPr>
+    </w:lvl>
+    <w:lvl w:ilvl="7" w:tentative="1">
+      <w:start w:val="1"/>
+      <w:numFmt w:val="decimal"/>
+      <w:lvlText w:val="%8."/>
+      <w:lvlJc w:val="left"/>
+      <w:pPr>
+        <w:tabs>
+          <w:tab w:val="num" w:pos="5760"/>
+        </w:tabs>
+        <w:ind w:left="5760" w:hanging="360"/>
+      </w:pPr>
+    </w:lvl>
+    <w:lvl w:ilvl="8" w:tentative="1">
+      <w:start w:val="1"/>
+      <w:numFmt w:val="decimal"/>
+      <w:lvlText w:val="%9."/>
+      <w:lvlJc w:val="left"/>
+      <w:pPr>
+        <w:tabs>
+          <w:tab w:val="num" w:pos="6480"/>
+        </w:tabs>
+        <w:ind w:left="6480" w:hanging="360"/>
+      </w:pPr>
+    </w:lvl>
+  </w:abstractNum>
+  <w:abstractNum w:abstractNumId="17" w15:restartNumberingAfterBreak="0">
     <w:nsid w:val="730F52F4"/>
     <w:multiLevelType w:val="multilevel"/>
     <w:tmpl w:val="3544E908"/>
@@ -2098,7 +3833,7 @@
       </w:pPr>
     </w:lvl>
   </w:abstractNum>
-  <w:abstractNum w:abstractNumId="12" w15:restartNumberingAfterBreak="0">
+  <w:abstractNum w:abstractNumId="18" w15:restartNumberingAfterBreak="0">
     <w:nsid w:val="755056BF"/>
     <w:multiLevelType w:val="multilevel"/>
     <w:tmpl w:val="703A0030"/>
@@ -2211,7 +3946,233 @@
       </w:pPr>
     </w:lvl>
   </w:abstractNum>
-  <w:abstractNum w:abstractNumId="13" w15:restartNumberingAfterBreak="0">
+  <w:abstractNum w:abstractNumId="19" w15:restartNumberingAfterBreak="0">
+    <w:nsid w:val="75587955"/>
+    <w:multiLevelType w:val="multilevel"/>
+    <w:tmpl w:val="2674721C"/>
+    <w:lvl w:ilvl="0">
+      <w:start w:val="41"/>
+      <w:numFmt w:val="decimal"/>
+      <w:lvlText w:val="%1."/>
+      <w:lvlJc w:val="left"/>
+      <w:pPr>
+        <w:tabs>
+          <w:tab w:val="num" w:pos="720"/>
+        </w:tabs>
+        <w:ind w:left="720" w:hanging="360"/>
+      </w:pPr>
+    </w:lvl>
+    <w:lvl w:ilvl="1" w:tentative="1">
+      <w:start w:val="1"/>
+      <w:numFmt w:val="decimal"/>
+      <w:lvlText w:val="%2."/>
+      <w:lvlJc w:val="left"/>
+      <w:pPr>
+        <w:tabs>
+          <w:tab w:val="num" w:pos="1440"/>
+        </w:tabs>
+        <w:ind w:left="1440" w:hanging="360"/>
+      </w:pPr>
+    </w:lvl>
+    <w:lvl w:ilvl="2" w:tentative="1">
+      <w:start w:val="1"/>
+      <w:numFmt w:val="decimal"/>
+      <w:lvlText w:val="%3."/>
+      <w:lvlJc w:val="left"/>
+      <w:pPr>
+        <w:tabs>
+          <w:tab w:val="num" w:pos="2160"/>
+        </w:tabs>
+        <w:ind w:left="2160" w:hanging="360"/>
+      </w:pPr>
+    </w:lvl>
+    <w:lvl w:ilvl="3" w:tentative="1">
+      <w:start w:val="1"/>
+      <w:numFmt w:val="decimal"/>
+      <w:lvlText w:val="%4."/>
+      <w:lvlJc w:val="left"/>
+      <w:pPr>
+        <w:tabs>
+          <w:tab w:val="num" w:pos="2880"/>
+        </w:tabs>
+        <w:ind w:left="2880" w:hanging="360"/>
+      </w:pPr>
+    </w:lvl>
+    <w:lvl w:ilvl="4" w:tentative="1">
+      <w:start w:val="1"/>
+      <w:numFmt w:val="decimal"/>
+      <w:lvlText w:val="%5."/>
+      <w:lvlJc w:val="left"/>
+      <w:pPr>
+        <w:tabs>
+          <w:tab w:val="num" w:pos="3600"/>
+        </w:tabs>
+        <w:ind w:left="3600" w:hanging="360"/>
+      </w:pPr>
+    </w:lvl>
+    <w:lvl w:ilvl="5" w:tentative="1">
+      <w:start w:val="1"/>
+      <w:numFmt w:val="decimal"/>
+      <w:lvlText w:val="%6."/>
+      <w:lvlJc w:val="left"/>
+      <w:pPr>
+        <w:tabs>
+          <w:tab w:val="num" w:pos="4320"/>
+        </w:tabs>
+        <w:ind w:left="4320" w:hanging="360"/>
+      </w:pPr>
+    </w:lvl>
+    <w:lvl w:ilvl="6" w:tentative="1">
+      <w:start w:val="1"/>
+      <w:numFmt w:val="decimal"/>
+      <w:lvlText w:val="%7."/>
+      <w:lvlJc w:val="left"/>
+      <w:pPr>
+        <w:tabs>
+          <w:tab w:val="num" w:pos="5040"/>
+        </w:tabs>
+        <w:ind w:left="5040" w:hanging="360"/>
+      </w:pPr>
+    </w:lvl>
+    <w:lvl w:ilvl="7" w:tentative="1">
+      <w:start w:val="1"/>
+      <w:numFmt w:val="decimal"/>
+      <w:lvlText w:val="%8."/>
+      <w:lvlJc w:val="left"/>
+      <w:pPr>
+        <w:tabs>
+          <w:tab w:val="num" w:pos="5760"/>
+        </w:tabs>
+        <w:ind w:left="5760" w:hanging="360"/>
+      </w:pPr>
+    </w:lvl>
+    <w:lvl w:ilvl="8" w:tentative="1">
+      <w:start w:val="1"/>
+      <w:numFmt w:val="decimal"/>
+      <w:lvlText w:val="%9."/>
+      <w:lvlJc w:val="left"/>
+      <w:pPr>
+        <w:tabs>
+          <w:tab w:val="num" w:pos="6480"/>
+        </w:tabs>
+        <w:ind w:left="6480" w:hanging="360"/>
+      </w:pPr>
+    </w:lvl>
+  </w:abstractNum>
+  <w:abstractNum w:abstractNumId="20" w15:restartNumberingAfterBreak="0">
+    <w:nsid w:val="75E51E31"/>
+    <w:multiLevelType w:val="multilevel"/>
+    <w:tmpl w:val="F6F22D08"/>
+    <w:lvl w:ilvl="0">
+      <w:start w:val="1"/>
+      <w:numFmt w:val="decimal"/>
+      <w:lvlText w:val="%1."/>
+      <w:lvlJc w:val="left"/>
+      <w:pPr>
+        <w:tabs>
+          <w:tab w:val="num" w:pos="720"/>
+        </w:tabs>
+        <w:ind w:left="720" w:hanging="360"/>
+      </w:pPr>
+    </w:lvl>
+    <w:lvl w:ilvl="1" w:tentative="1">
+      <w:start w:val="1"/>
+      <w:numFmt w:val="decimal"/>
+      <w:lvlText w:val="%2."/>
+      <w:lvlJc w:val="left"/>
+      <w:pPr>
+        <w:tabs>
+          <w:tab w:val="num" w:pos="1440"/>
+        </w:tabs>
+        <w:ind w:left="1440" w:hanging="360"/>
+      </w:pPr>
+    </w:lvl>
+    <w:lvl w:ilvl="2" w:tentative="1">
+      <w:start w:val="1"/>
+      <w:numFmt w:val="decimal"/>
+      <w:lvlText w:val="%3."/>
+      <w:lvlJc w:val="left"/>
+      <w:pPr>
+        <w:tabs>
+          <w:tab w:val="num" w:pos="2160"/>
+        </w:tabs>
+        <w:ind w:left="2160" w:hanging="360"/>
+      </w:pPr>
+    </w:lvl>
+    <w:lvl w:ilvl="3" w:tentative="1">
+      <w:start w:val="1"/>
+      <w:numFmt w:val="decimal"/>
+      <w:lvlText w:val="%4."/>
+      <w:lvlJc w:val="left"/>
+      <w:pPr>
+        <w:tabs>
+          <w:tab w:val="num" w:pos="2880"/>
+        </w:tabs>
+        <w:ind w:left="2880" w:hanging="360"/>
+      </w:pPr>
+    </w:lvl>
+    <w:lvl w:ilvl="4" w:tentative="1">
+      <w:start w:val="1"/>
+      <w:numFmt w:val="decimal"/>
+      <w:lvlText w:val="%5."/>
+      <w:lvlJc w:val="left"/>
+      <w:pPr>
+        <w:tabs>
+          <w:tab w:val="num" w:pos="3600"/>
+        </w:tabs>
+        <w:ind w:left="3600" w:hanging="360"/>
+      </w:pPr>
+    </w:lvl>
+    <w:lvl w:ilvl="5" w:tentative="1">
+      <w:start w:val="1"/>
+      <w:numFmt w:val="decimal"/>
+      <w:lvlText w:val="%6."/>
+      <w:lvlJc w:val="left"/>
+      <w:pPr>
+        <w:tabs>
+          <w:tab w:val="num" w:pos="4320"/>
+        </w:tabs>
+        <w:ind w:left="4320" w:hanging="360"/>
+      </w:pPr>
+    </w:lvl>
+    <w:lvl w:ilvl="6" w:tentative="1">
+      <w:start w:val="1"/>
+      <w:numFmt w:val="decimal"/>
+      <w:lvlText w:val="%7."/>
+      <w:lvlJc w:val="left"/>
+      <w:pPr>
+        <w:tabs>
+          <w:tab w:val="num" w:pos="5040"/>
+        </w:tabs>
+        <w:ind w:left="5040" w:hanging="360"/>
+      </w:pPr>
+    </w:lvl>
+    <w:lvl w:ilvl="7" w:tentative="1">
+      <w:start w:val="1"/>
+      <w:numFmt w:val="decimal"/>
+      <w:lvlText w:val="%8."/>
+      <w:lvlJc w:val="left"/>
+      <w:pPr>
+        <w:tabs>
+          <w:tab w:val="num" w:pos="5760"/>
+        </w:tabs>
+        <w:ind w:left="5760" w:hanging="360"/>
+      </w:pPr>
+    </w:lvl>
+    <w:lvl w:ilvl="8" w:tentative="1">
+      <w:start w:val="1"/>
+      <w:numFmt w:val="decimal"/>
+      <w:lvlText w:val="%9."/>
+      <w:lvlJc w:val="left"/>
+      <w:pPr>
+        <w:tabs>
+          <w:tab w:val="num" w:pos="6480"/>
+        </w:tabs>
+        <w:ind w:left="6480" w:hanging="360"/>
+      </w:pPr>
+    </w:lvl>
+  </w:abstractNum>
+  <w:abstractNum w:abstractNumId="21" w15:restartNumberingAfterBreak="0">
     <w:nsid w:val="792F63B6"/>
     <w:multiLevelType w:val="multilevel"/>
     <w:tmpl w:val="022494B0"/>
@@ -2325,46 +4286,70 @@
     </w:lvl>
   </w:abstractNum>
   <w:num w:numId="1" w16cid:durableId="1875148189">
+    <w:abstractNumId w:val="13"/>
+  </w:num>
+  <w:num w:numId="2" w16cid:durableId="325017824">
     <w:abstractNumId w:val="9"/>
   </w:num>
-  <w:num w:numId="2" w16cid:durableId="325017824">
-    <w:abstractNumId w:val="6"/>
-  </w:num>
   <w:num w:numId="3" w16cid:durableId="1946958737">
-    <w:abstractNumId w:val="4"/>
+    <w:abstractNumId w:val="5"/>
   </w:num>
   <w:num w:numId="4" w16cid:durableId="1062101937">
+    <w:abstractNumId w:val="18"/>
+  </w:num>
+  <w:num w:numId="5" w16cid:durableId="1353068640">
     <w:abstractNumId w:val="12"/>
   </w:num>
-  <w:num w:numId="5" w16cid:durableId="1353068640">
-    <w:abstractNumId w:val="8"/>
-  </w:num>
   <w:num w:numId="6" w16cid:durableId="1663894452">
-    <w:abstractNumId w:val="1"/>
+    <w:abstractNumId w:val="2"/>
   </w:num>
   <w:num w:numId="7" w16cid:durableId="1723209389">
-    <w:abstractNumId w:val="7"/>
+    <w:abstractNumId w:val="10"/>
   </w:num>
   <w:num w:numId="8" w16cid:durableId="252981753">
-    <w:abstractNumId w:val="2"/>
+    <w:abstractNumId w:val="3"/>
   </w:num>
   <w:num w:numId="9" w16cid:durableId="558709840">
-    <w:abstractNumId w:val="10"/>
+    <w:abstractNumId w:val="14"/>
   </w:num>
   <w:num w:numId="10" w16cid:durableId="1351295017">
     <w:abstractNumId w:val="0"/>
   </w:num>
   <w:num w:numId="11" w16cid:durableId="1583641370">
-    <w:abstractNumId w:val="13"/>
+    <w:abstractNumId w:val="21"/>
   </w:num>
   <w:num w:numId="12" w16cid:durableId="1345206877">
+    <w:abstractNumId w:val="17"/>
+  </w:num>
+  <w:num w:numId="13" w16cid:durableId="1744451564">
+    <w:abstractNumId w:val="8"/>
+  </w:num>
+  <w:num w:numId="14" w16cid:durableId="2145004148">
+    <w:abstractNumId w:val="4"/>
+  </w:num>
+  <w:num w:numId="15" w16cid:durableId="1682732194">
+    <w:abstractNumId w:val="1"/>
+  </w:num>
+  <w:num w:numId="16" w16cid:durableId="1671635278">
+    <w:abstractNumId w:val="6"/>
+  </w:num>
+  <w:num w:numId="17" w16cid:durableId="1980377555">
+    <w:abstractNumId w:val="15"/>
+  </w:num>
+  <w:num w:numId="18" w16cid:durableId="762335500">
+    <w:abstractNumId w:val="7"/>
+  </w:num>
+  <w:num w:numId="19" w16cid:durableId="314333488">
+    <w:abstractNumId w:val="19"/>
+  </w:num>
+  <w:num w:numId="20" w16cid:durableId="1071006223">
     <w:abstractNumId w:val="11"/>
   </w:num>
-  <w:num w:numId="13" w16cid:durableId="1744451564">
-    <w:abstractNumId w:val="5"/>
+  <w:num w:numId="21" w16cid:durableId="1256282687">
+    <w:abstractNumId w:val="16"/>
   </w:num>
-  <w:num w:numId="14" w16cid:durableId="2145004148">
-    <w:abstractNumId w:val="3"/>
+  <w:num w:numId="22" w16cid:durableId="1758599406">
+    <w:abstractNumId w:val="20"/>
   </w:num>
 </w:numbering>
 </file>

</xml_diff>